<commit_message>
Remove GRE app and organizations lines from one-page resume
Co-Authored-By: Claude Sonnet 5.5 <noreply@anthropic.com>
Claude-Session: https://claude.ai/code/session_01XkEbCnMqfmtS8r4hiaCjgq
</commit_message>
<xml_diff>
--- a/Resume_TAMU_20261009_1page.docx
+++ b/Resume_TAMU_20261009_1page.docx
@@ -751,8 +751,7 @@
     <w:p>
       <w:pPr>
         <w:keepNext/>
-        <w:spacing w:before="50" w:after="0" w:line="240" w:lineRule="auto"/>
-        <w:ind w:left="360"/>
+        <w:spacing w:before="60" w:after="20" w:line="240" w:lineRule="auto"/>
       </w:pPr>
       <w:r>
         <w:rPr>
@@ -762,31 +761,13 @@
           <w:sz w:val="19"/>
           <w:szCs w:val="19"/>
         </w:rPr>
-        <w:t xml:space="preserve">GRE Flashcard Web App</w:t>
-      </w:r>
-      <w:r>
-        <w:rPr>
-          <w:rFonts w:ascii="Times New Roman" w:cs="Times New Roman" w:eastAsia="Times New Roman" w:hAnsi="Times New Roman"/>
-          <w:i/>
-          <w:iCs/>
-          <w:sz w:val="19"/>
-          <w:szCs w:val="19"/>
-        </w:rPr>
-        <w:t xml:space="preserve">; Solo Developer</w:t>
-      </w:r>
-      <w:r>
-        <w:rPr>
-          <w:rFonts w:ascii="Times New Roman" w:cs="Times New Roman" w:eastAsia="Times New Roman" w:hAnsi="Times New Roman"/>
-          <w:sz w:val="19"/>
-          <w:szCs w:val="19"/>
-        </w:rPr>
-        <w:t xml:space="preserve">, 2025 – Present</w:t>
-      </w:r>
-    </w:p>
-    <w:p>
-      <w:pPr>
-        <w:keepNext/>
-        <w:spacing w:before="60" w:after="20" w:line="240" w:lineRule="auto"/>
+        <w:t xml:space="preserve">SKILLS</w:t>
+      </w:r>
+    </w:p>
+    <w:p>
+      <w:pPr>
+        <w:spacing w:before="0" w:after="0" w:line="240" w:lineRule="auto"/>
+        <w:ind w:left="360"/>
       </w:pPr>
       <w:r>
         <w:rPr>
@@ -796,7 +777,15 @@
           <w:sz w:val="19"/>
           <w:szCs w:val="19"/>
         </w:rPr>
-        <w:t xml:space="preserve">SKILLS</w:t>
+        <w:t xml:space="preserve">Technical: </w:t>
+      </w:r>
+      <w:r>
+        <w:rPr>
+          <w:rFonts w:ascii="Times New Roman" w:cs="Times New Roman" w:eastAsia="Times New Roman" w:hAnsi="Times New Roman"/>
+          <w:sz w:val="19"/>
+          <w:szCs w:val="19"/>
+        </w:rPr>
+        <w:t xml:space="preserve">SQL, Python, Power BI, Tableau, Oracle BI, Google Analytics 4, Google Tag Manager, Figma, PROS O&amp;D RMS/RTDP, Amadeus RMS, DDS, MIDT, CIRIUM, Claude Code</w:t>
       </w:r>
     </w:p>
     <w:p>
@@ -812,15 +801,15 @@
           <w:sz w:val="19"/>
           <w:szCs w:val="19"/>
         </w:rPr>
-        <w:t xml:space="preserve">Technical: </w:t>
-      </w:r>
-      <w:r>
-        <w:rPr>
-          <w:rFonts w:ascii="Times New Roman" w:cs="Times New Roman" w:eastAsia="Times New Roman" w:hAnsi="Times New Roman"/>
-          <w:sz w:val="19"/>
-          <w:szCs w:val="19"/>
-        </w:rPr>
-        <w:t xml:space="preserve">SQL, Python, Power BI, Tableau, Oracle BI, Google Analytics 4, Google Tag Manager, Figma, PROS O&amp;D RMS/RTDP, Amadeus RMS, DDS, MIDT, CIRIUM, Claude Code</w:t>
+        <w:t xml:space="preserve">Certifications: </w:t>
+      </w:r>
+      <w:r>
+        <w:rPr>
+          <w:rFonts w:ascii="Times New Roman" w:cs="Times New Roman" w:eastAsia="Times New Roman" w:hAnsi="Times New Roman"/>
+          <w:sz w:val="19"/>
+          <w:szCs w:val="19"/>
+        </w:rPr>
+        <w:t xml:space="preserve">PMP (PMI, 2026); CPIM (ASCM, 2025)</w:t>
       </w:r>
     </w:p>
     <w:p>
@@ -836,30 +825,6 @@
           <w:sz w:val="19"/>
           <w:szCs w:val="19"/>
         </w:rPr>
-        <w:t xml:space="preserve">Certifications: </w:t>
-      </w:r>
-      <w:r>
-        <w:rPr>
-          <w:rFonts w:ascii="Times New Roman" w:cs="Times New Roman" w:eastAsia="Times New Roman" w:hAnsi="Times New Roman"/>
-          <w:sz w:val="19"/>
-          <w:szCs w:val="19"/>
-        </w:rPr>
-        <w:t xml:space="preserve">PMP (PMI, 2026); CPIM (ASCM, 2025)</w:t>
-      </w:r>
-    </w:p>
-    <w:p>
-      <w:pPr>
-        <w:spacing w:before="0" w:after="0" w:line="240" w:lineRule="auto"/>
-        <w:ind w:left="360"/>
-      </w:pPr>
-      <w:r>
-        <w:rPr>
-          <w:rFonts w:ascii="Times New Roman" w:cs="Times New Roman" w:eastAsia="Times New Roman" w:hAnsi="Times New Roman"/>
-          <w:b/>
-          <w:bCs/>
-          <w:sz w:val="19"/>
-          <w:szCs w:val="19"/>
-        </w:rPr>
         <w:t xml:space="preserve">Languages: </w:t>
       </w:r>
       <w:r>
@@ -869,46 +834,6 @@
           <w:szCs w:val="19"/>
         </w:rPr>
         <w:t xml:space="preserve">Korean (Native), English (Proficient), Japanese (Fluent), Chinese (Basic)</w:t>
-      </w:r>
-    </w:p>
-    <w:p>
-      <w:pPr>
-        <w:keepNext/>
-        <w:spacing w:before="60" w:after="20" w:line="240" w:lineRule="auto"/>
-      </w:pPr>
-      <w:r>
-        <w:rPr>
-          <w:rFonts w:ascii="Times New Roman" w:cs="Times New Roman" w:eastAsia="Times New Roman" w:hAnsi="Times New Roman"/>
-          <w:b/>
-          <w:bCs/>
-          <w:sz w:val="19"/>
-          <w:szCs w:val="19"/>
-        </w:rPr>
-        <w:t xml:space="preserve">PROFESSIONAL ORGANIZATIONS &amp; ACTIVITIES</w:t>
-      </w:r>
-    </w:p>
-    <w:p>
-      <w:pPr>
-        <w:spacing w:before="0" w:after="0" w:line="240" w:lineRule="auto"/>
-        <w:ind w:left="360"/>
-      </w:pPr>
-      <w:r>
-        <w:rPr>
-          <w:rFonts w:ascii="Times New Roman" w:cs="Times New Roman" w:eastAsia="Times New Roman" w:hAnsi="Times New Roman"/>
-          <w:b/>
-          <w:bCs/>
-          <w:sz w:val="19"/>
-          <w:szCs w:val="19"/>
-        </w:rPr>
-        <w:t xml:space="preserve">Task Forces, Korean Air: UAM Business; Cloud Data Analysis Environment; Passenger Transport Productivity</w:t>
-      </w:r>
-      <w:r>
-        <w:rPr>
-          <w:rFonts w:ascii="Times New Roman" w:cs="Times New Roman" w:eastAsia="Times New Roman" w:hAnsi="Times New Roman"/>
-          <w:sz w:val="19"/>
-          <w:szCs w:val="19"/>
-        </w:rPr>
-        <w:t xml:space="preserve"/>
       </w:r>
     </w:p>
     <w:sectPr>

</xml_diff>

<commit_message>
Increase one-page resume font size to 10pt
Co-Authored-By: Claude Sonnet 5.5 <noreply@anthropic.com>
Claude-Session: https://claude.ai/code/session_01XkEbCnMqfmtS8r4hiaCjgq
</commit_message>
<xml_diff>
--- a/Resume_TAMU_20261009_1page.docx
+++ b/Resume_TAMU_20261009_1page.docx
@@ -29,8 +29,8 @@
       <w:r>
         <w:rPr>
           <w:rFonts w:ascii="Times New Roman" w:cs="Times New Roman" w:eastAsia="Times New Roman" w:hAnsi="Times New Roman"/>
-          <w:sz w:val="19"/>
-          <w:szCs w:val="19"/>
+          <w:sz w:val="20"/>
+          <w:szCs w:val="20"/>
         </w:rPr>
         <w:t xml:space="preserve">Seoul, Korea  •  +82-10-3613-3315  •  swchung2469@gmail.com  •  linkedin.com/in/sukwoo-chung-b62ba1157</w:t>
       </w:r>
@@ -45,8 +45,8 @@
           <w:rFonts w:ascii="Times New Roman" w:cs="Times New Roman" w:eastAsia="Times New Roman" w:hAnsi="Times New Roman"/>
           <w:b/>
           <w:bCs/>
-          <w:sz w:val="19"/>
-          <w:szCs w:val="19"/>
+          <w:sz w:val="20"/>
+          <w:szCs w:val="20"/>
         </w:rPr>
         <w:t xml:space="preserve">OBJECTIVE</w:t>
       </w:r>
@@ -59,8 +59,8 @@
       <w:r>
         <w:rPr>
           <w:rFonts w:ascii="Times New Roman" w:cs="Times New Roman" w:eastAsia="Times New Roman" w:hAnsi="Times New Roman"/>
-          <w:sz w:val="19"/>
-          <w:szCs w:val="19"/>
+          <w:sz w:val="20"/>
+          <w:szCs w:val="20"/>
         </w:rPr>
         <w:t xml:space="preserve">Seeking admission to a Master of Science in Business Analytics program to apply 10+ years of forecasting, pricing, and logistics analytics experience to data-driven decision making.</w:t>
       </w:r>
@@ -75,8 +75,8 @@
           <w:rFonts w:ascii="Times New Roman" w:cs="Times New Roman" w:eastAsia="Times New Roman" w:hAnsi="Times New Roman"/>
           <w:b/>
           <w:bCs/>
-          <w:sz w:val="19"/>
-          <w:szCs w:val="19"/>
+          <w:sz w:val="20"/>
+          <w:szCs w:val="20"/>
         </w:rPr>
         <w:t xml:space="preserve">EDUCATION</w:t>
       </w:r>
@@ -92,8 +92,8 @@
           <w:rFonts w:ascii="Times New Roman" w:cs="Times New Roman" w:eastAsia="Times New Roman" w:hAnsi="Times New Roman"/>
           <w:b/>
           <w:bCs/>
-          <w:sz w:val="19"/>
-          <w:szCs w:val="19"/>
+          <w:sz w:val="20"/>
+          <w:szCs w:val="20"/>
         </w:rPr>
         <w:t xml:space="preserve">University of Wisconsin–Madison, Madison, Wisconsin</w:t>
       </w:r>
@@ -108,16 +108,16 @@
           <w:rFonts w:ascii="Times New Roman" w:cs="Times New Roman" w:eastAsia="Times New Roman" w:hAnsi="Times New Roman"/>
           <w:i/>
           <w:iCs/>
-          <w:sz w:val="19"/>
-          <w:szCs w:val="19"/>
+          <w:sz w:val="20"/>
+          <w:szCs w:val="20"/>
         </w:rPr>
         <w:t xml:space="preserve">Bachelor of Business Administration in Finance, Investment &amp; Banking</w:t>
       </w:r>
       <w:r>
         <w:rPr>
           <w:rFonts w:ascii="Times New Roman" w:cs="Times New Roman" w:eastAsia="Times New Roman" w:hAnsi="Times New Roman"/>
-          <w:sz w:val="19"/>
-          <w:szCs w:val="19"/>
+          <w:sz w:val="20"/>
+          <w:szCs w:val="20"/>
         </w:rPr>
         <w:t xml:space="preserve">, August 2013</w:t>
       </w:r>
@@ -130,8 +130,8 @@
       <w:r>
         <w:rPr>
           <w:rFonts w:ascii="Times New Roman" w:cs="Times New Roman" w:eastAsia="Times New Roman" w:hAnsi="Times New Roman"/>
-          <w:sz w:val="19"/>
-          <w:szCs w:val="19"/>
+          <w:sz w:val="20"/>
+          <w:szCs w:val="20"/>
         </w:rPr>
         <w:t xml:space="preserve">Cumulative GPA: 3.46/4.00</w:t>
       </w:r>
@@ -146,16 +146,16 @@
           <w:rFonts w:ascii="Times New Roman" w:cs="Times New Roman" w:eastAsia="Times New Roman" w:hAnsi="Times New Roman"/>
           <w:b/>
           <w:bCs/>
-          <w:sz w:val="19"/>
-          <w:szCs w:val="19"/>
+          <w:sz w:val="20"/>
+          <w:szCs w:val="20"/>
         </w:rPr>
         <w:t xml:space="preserve">Study Abroad: </w:t>
       </w:r>
       <w:r>
         <w:rPr>
           <w:rFonts w:ascii="Times New Roman" w:cs="Times New Roman" w:eastAsia="Times New Roman" w:hAnsi="Times New Roman"/>
-          <w:sz w:val="19"/>
-          <w:szCs w:val="19"/>
+          <w:sz w:val="20"/>
+          <w:szCs w:val="20"/>
         </w:rPr>
         <w:t xml:space="preserve">National University of Singapore (NUS) Business School, Singapore, August 2012 – December 2012</w:t>
       </w:r>
@@ -170,8 +170,8 @@
           <w:rFonts w:ascii="Times New Roman" w:cs="Times New Roman" w:eastAsia="Times New Roman" w:hAnsi="Times New Roman"/>
           <w:b/>
           <w:bCs/>
-          <w:sz w:val="19"/>
-          <w:szCs w:val="19"/>
+          <w:sz w:val="20"/>
+          <w:szCs w:val="20"/>
         </w:rPr>
         <w:t xml:space="preserve">EXPERIENCE</w:t>
       </w:r>
@@ -187,8 +187,8 @@
           <w:rFonts w:ascii="Times New Roman" w:cs="Times New Roman" w:eastAsia="Times New Roman" w:hAnsi="Times New Roman"/>
           <w:b/>
           <w:bCs/>
-          <w:sz w:val="19"/>
-          <w:szCs w:val="19"/>
+          <w:sz w:val="20"/>
+          <w:szCs w:val="20"/>
         </w:rPr>
         <w:t xml:space="preserve">Samsung SDS, Pangyo, Korea</w:t>
       </w:r>
@@ -204,16 +204,16 @@
           <w:rFonts w:ascii="Times New Roman" w:cs="Times New Roman" w:eastAsia="Times New Roman" w:hAnsi="Times New Roman"/>
           <w:i/>
           <w:iCs/>
-          <w:sz w:val="19"/>
-          <w:szCs w:val="19"/>
+          <w:sz w:val="20"/>
+          <w:szCs w:val="20"/>
         </w:rPr>
         <w:t xml:space="preserve">Senior Data Analyst, Logistics Data Innovation (Cello Square)</w:t>
       </w:r>
       <w:r>
         <w:rPr>
           <w:rFonts w:ascii="Times New Roman" w:cs="Times New Roman" w:eastAsia="Times New Roman" w:hAnsi="Times New Roman"/>
-          <w:sz w:val="19"/>
-          <w:szCs w:val="19"/>
+          <w:sz w:val="20"/>
+          <w:szCs w:val="20"/>
         </w:rPr>
         <w:t xml:space="preserve">, September 2024 – Present</w:t>
       </w:r>
@@ -236,8 +236,8 @@
       <w:r>
         <w:rPr>
           <w:rFonts w:ascii="Times New Roman" w:cs="Times New Roman" w:eastAsia="Times New Roman" w:hAnsi="Times New Roman"/>
-          <w:sz w:val="19"/>
-          <w:szCs w:val="19"/>
+          <w:sz w:val="20"/>
+          <w:szCs w:val="20"/>
         </w:rPr>
         <w:t xml:space="preserve">Lead a 6-person Freight Volume Aggregation Improvement Task Force to standardize volume classification across 6 regions and 10 organizations, establishing a company-wide authoritative dataset</w:t>
       </w:r>
@@ -260,8 +260,8 @@
       <w:r>
         <w:rPr>
           <w:rFonts w:ascii="Times New Roman" w:cs="Times New Roman" w:eastAsia="Times New Roman" w:hAnsi="Times New Roman"/>
-          <w:sz w:val="19"/>
-          <w:szCs w:val="19"/>
+          <w:sz w:val="20"/>
+          <w:szCs w:val="20"/>
         </w:rPr>
         <w:t xml:space="preserve">Traced discrepancies to shipment events in SQL and redesigned 4 freight-aggregation rules with mandatory-field and upper-bound validation, restoring 28,306 forty-foot equivalent units (FEU) of misclassified 2025 volume and cutting anomalous records from 0.80% to 0.56% in two months</w:t>
       </w:r>
@@ -284,8 +284,8 @@
       <w:r>
         <w:rPr>
           <w:rFonts w:ascii="Times New Roman" w:cs="Times New Roman" w:eastAsia="Times New Roman" w:hAnsi="Times New Roman"/>
-          <w:sz w:val="19"/>
-          <w:szCs w:val="19"/>
+          <w:sz w:val="20"/>
+          <w:szCs w:val="20"/>
         </w:rPr>
         <w:t xml:space="preserve">Diagnosed Cello Square customer journey friction using Google Analytics 4, Google Tag Manager, and internal data, identifying fragmented rate-search paths and quote delays linked to customer drop-off and recommending improvements</w:t>
       </w:r>
@@ -301,8 +301,8 @@
           <w:rFonts w:ascii="Times New Roman" w:cs="Times New Roman" w:eastAsia="Times New Roman" w:hAnsi="Times New Roman"/>
           <w:b/>
           <w:bCs/>
-          <w:sz w:val="19"/>
-          <w:szCs w:val="19"/>
+          <w:sz w:val="20"/>
+          <w:szCs w:val="20"/>
         </w:rPr>
         <w:t xml:space="preserve">Korean Air, Seoul, Korea / Manila, Philippines</w:t>
       </w:r>
@@ -318,16 +318,16 @@
           <w:rFonts w:ascii="Times New Roman" w:cs="Times New Roman" w:eastAsia="Times New Roman" w:hAnsi="Times New Roman"/>
           <w:i/>
           <w:iCs/>
-          <w:sz w:val="19"/>
-          <w:szCs w:val="19"/>
+          <w:sz w:val="20"/>
+          <w:szCs w:val="20"/>
         </w:rPr>
         <w:t xml:space="preserve">Project Manager, Group Sales Optimization &amp; RM Strategy</w:t>
       </w:r>
       <w:r>
         <w:rPr>
           <w:rFonts w:ascii="Times New Roman" w:cs="Times New Roman" w:eastAsia="Times New Roman" w:hAnsi="Times New Roman"/>
-          <w:sz w:val="19"/>
-          <w:szCs w:val="19"/>
+          <w:sz w:val="20"/>
+          <w:szCs w:val="20"/>
         </w:rPr>
         <w:t xml:space="preserve">, April 2023 – August 2024</w:t>
       </w:r>
@@ -350,8 +350,8 @@
       <w:r>
         <w:rPr>
           <w:rFonts w:ascii="Times New Roman" w:cs="Times New Roman" w:eastAsia="Times New Roman" w:hAnsi="Times New Roman"/>
-          <w:sz w:val="19"/>
-          <w:szCs w:val="19"/>
+          <w:sz w:val="20"/>
+          <w:szCs w:val="20"/>
         </w:rPr>
         <w:t xml:space="preserve">Managed the 17-month Group Sales Optimizer project, coordinating PROS, JAL/ANA, and Korean Air pricing, IT, analytics, and operations teams to translate sales rules into automated booking workflows</w:t>
       </w:r>
@@ -374,8 +374,8 @@
       <w:r>
         <w:rPr>
           <w:rFonts w:ascii="Times New Roman" w:cs="Times New Roman" w:eastAsia="Times New Roman" w:hAnsi="Times New Roman"/>
-          <w:sz w:val="19"/>
-          <w:szCs w:val="19"/>
+          <w:sz w:val="20"/>
+          <w:szCs w:val="20"/>
         </w:rPr>
         <w:t xml:space="preserve">Developed a reservation misuse monitoring tool (SQL, Tableau) that translated suspicious booking behavior into rules for sales teams to investigate, flagging 600+ cases annually and helping prevent an estimated $370K in annual revenue leakage; earned Korean Air’s Quarterly IT Excellence Project Award</w:t>
       </w:r>
@@ -391,16 +391,16 @@
           <w:rFonts w:ascii="Times New Roman" w:cs="Times New Roman" w:eastAsia="Times New Roman" w:hAnsi="Times New Roman"/>
           <w:i/>
           <w:iCs/>
-          <w:sz w:val="19"/>
-          <w:szCs w:val="19"/>
+          <w:sz w:val="20"/>
+          <w:szCs w:val="20"/>
         </w:rPr>
         <w:t xml:space="preserve">Regional Sales Marketing Manager, Philippines Regional Office (Manila)</w:t>
       </w:r>
       <w:r>
         <w:rPr>
           <w:rFonts w:ascii="Times New Roman" w:cs="Times New Roman" w:eastAsia="Times New Roman" w:hAnsi="Times New Roman"/>
-          <w:sz w:val="19"/>
-          <w:szCs w:val="19"/>
+          <w:sz w:val="20"/>
+          <w:szCs w:val="20"/>
         </w:rPr>
         <w:t xml:space="preserve">, September 2022 – April 2023</w:t>
       </w:r>
@@ -423,8 +423,8 @@
       <w:r>
         <w:rPr>
           <w:rFonts w:ascii="Times New Roman" w:cs="Times New Roman" w:eastAsia="Times New Roman" w:hAnsi="Times New Roman"/>
-          <w:sz w:val="19"/>
-          <w:szCs w:val="19"/>
+          <w:sz w:val="20"/>
+          <w:szCs w:val="20"/>
         </w:rPr>
         <w:t xml:space="preserve">Led a 7-person sales team across Manila, Cebu, and Guam during the market recovery, driving group reservations +340% YoY and restoring volume to 80% of the 2019 pre-COVID-19 baseline</w:t>
       </w:r>
@@ -440,16 +440,16 @@
           <w:rFonts w:ascii="Times New Roman" w:cs="Times New Roman" w:eastAsia="Times New Roman" w:hAnsi="Times New Roman"/>
           <w:i/>
           <w:iCs/>
-          <w:sz w:val="19"/>
-          <w:szCs w:val="19"/>
+          <w:sz w:val="20"/>
+          <w:szCs w:val="20"/>
         </w:rPr>
         <w:t xml:space="preserve">Revenue Management &amp; Pricing Systems Manager</w:t>
       </w:r>
       <w:r>
         <w:rPr>
           <w:rFonts w:ascii="Times New Roman" w:cs="Times New Roman" w:eastAsia="Times New Roman" w:hAnsi="Times New Roman"/>
-          <w:sz w:val="19"/>
-          <w:szCs w:val="19"/>
+          <w:sz w:val="20"/>
+          <w:szCs w:val="20"/>
         </w:rPr>
         <w:t xml:space="preserve">, April 2021 – September 2022</w:t>
       </w:r>
@@ -472,8 +472,8 @@
       <w:r>
         <w:rPr>
           <w:rFonts w:ascii="Times New Roman" w:cs="Times New Roman" w:eastAsia="Times New Roman" w:hAnsi="Times New Roman"/>
-          <w:sz w:val="19"/>
-          <w:szCs w:val="19"/>
+          <w:sz w:val="20"/>
+          <w:szCs w:val="20"/>
         </w:rPr>
         <w:t xml:space="preserve">Implemented logistic regression and random forest models in Python to analyze route-level recovery during COVID-19 and inform demand forecasting and dynamic pricing decisions</w:t>
       </w:r>
@@ -496,8 +496,8 @@
       <w:r>
         <w:rPr>
           <w:rFonts w:ascii="Times New Roman" w:cs="Times New Roman" w:eastAsia="Times New Roman" w:hAnsi="Times New Roman"/>
-          <w:sz w:val="19"/>
-          <w:szCs w:val="19"/>
+          <w:sz w:val="20"/>
+          <w:szCs w:val="20"/>
         </w:rPr>
         <w:t xml:space="preserve">Evaluated Amadeus RMS as a competitive alternative during PROS contract renewal, contributing to $3.32M in 5-year cost savings while mentoring 4 junior colleagues on forecasting and pricing</w:t>
       </w:r>
@@ -513,16 +513,16 @@
           <w:rFonts w:ascii="Times New Roman" w:cs="Times New Roman" w:eastAsia="Times New Roman" w:hAnsi="Times New Roman"/>
           <w:i/>
           <w:iCs/>
-          <w:sz w:val="19"/>
-          <w:szCs w:val="19"/>
+          <w:sz w:val="20"/>
+          <w:szCs w:val="20"/>
         </w:rPr>
         <w:t xml:space="preserve">Passenger Division Data Analyst &amp; System Administrator</w:t>
       </w:r>
       <w:r>
         <w:rPr>
           <w:rFonts w:ascii="Times New Roman" w:cs="Times New Roman" w:eastAsia="Times New Roman" w:hAnsi="Times New Roman"/>
-          <w:sz w:val="19"/>
-          <w:szCs w:val="19"/>
+          <w:sz w:val="20"/>
+          <w:szCs w:val="20"/>
         </w:rPr>
         <w:t xml:space="preserve">, January 2017 – April 2021</w:t>
       </w:r>
@@ -545,8 +545,8 @@
       <w:r>
         <w:rPr>
           <w:rFonts w:ascii="Times New Roman" w:cs="Times New Roman" w:eastAsia="Times New Roman" w:hAnsi="Times New Roman"/>
-          <w:sz w:val="19"/>
-          <w:szCs w:val="19"/>
+          <w:sz w:val="20"/>
+          <w:szCs w:val="20"/>
         </w:rPr>
         <w:t xml:space="preserve">Integrated 100M+ ticketing and flown records with Delta Air Lines’ passenger data in 9 months following the transpacific joint venture launch, using a shared glossary for currency and codeshare accounting so both carriers could base decisions on the same dataset</w:t>
       </w:r>
@@ -569,8 +569,8 @@
       <w:r>
         <w:rPr>
           <w:rFonts w:ascii="Times New Roman" w:cs="Times New Roman" w:eastAsia="Times New Roman" w:hAnsi="Times New Roman"/>
-          <w:sz w:val="19"/>
-          <w:szCs w:val="19"/>
+          <w:sz w:val="20"/>
+          <w:szCs w:val="20"/>
         </w:rPr>
         <w:t xml:space="preserve">Renegotiated the IATA DDS data contract during COVID-19, securing $390K in cost savings; delivered 74 hours of Data/BI training to sales and network-planning teams in Korean and English</w:t>
       </w:r>
@@ -586,16 +586,16 @@
           <w:rFonts w:ascii="Times New Roman" w:cs="Times New Roman" w:eastAsia="Times New Roman" w:hAnsi="Times New Roman"/>
           <w:i/>
           <w:iCs/>
-          <w:sz w:val="19"/>
-          <w:szCs w:val="19"/>
+          <w:sz w:val="20"/>
+          <w:szCs w:val="20"/>
         </w:rPr>
         <w:t xml:space="preserve">Sales Support Assistant Manager &amp; Sales Representative</w:t>
       </w:r>
       <w:r>
         <w:rPr>
           <w:rFonts w:ascii="Times New Roman" w:cs="Times New Roman" w:eastAsia="Times New Roman" w:hAnsi="Times New Roman"/>
-          <w:sz w:val="19"/>
-          <w:szCs w:val="19"/>
+          <w:sz w:val="20"/>
+          <w:szCs w:val="20"/>
         </w:rPr>
         <w:t xml:space="preserve">, January 2014 – December 2016</w:t>
       </w:r>
@@ -610,8 +610,8 @@
           <w:rFonts w:ascii="Times New Roman" w:cs="Times New Roman" w:eastAsia="Times New Roman" w:hAnsi="Times New Roman"/>
           <w:b/>
           <w:bCs/>
-          <w:sz w:val="19"/>
-          <w:szCs w:val="19"/>
+          <w:sz w:val="20"/>
+          <w:szCs w:val="20"/>
         </w:rPr>
         <w:t xml:space="preserve">PROJECTS &amp; ENTREPRENEURSHIP</w:t>
       </w:r>
@@ -627,8 +627,8 @@
           <w:rFonts w:ascii="Times New Roman" w:cs="Times New Roman" w:eastAsia="Times New Roman" w:hAnsi="Times New Roman"/>
           <w:b/>
           <w:bCs/>
-          <w:sz w:val="19"/>
-          <w:szCs w:val="19"/>
+          <w:sz w:val="20"/>
+          <w:szCs w:val="20"/>
         </w:rPr>
         <w:t xml:space="preserve">AiMollaeBook (Yugaswimpyo Brand), Seoul, Korea</w:t>
       </w:r>
@@ -644,16 +644,16 @@
           <w:rFonts w:ascii="Times New Roman" w:cs="Times New Roman" w:eastAsia="Times New Roman" w:hAnsi="Times New Roman"/>
           <w:i/>
           <w:iCs/>
-          <w:sz w:val="19"/>
-          <w:szCs w:val="19"/>
+          <w:sz w:val="20"/>
+          <w:szCs w:val="20"/>
         </w:rPr>
         <w:t xml:space="preserve">Founder &amp; Product Owner</w:t>
       </w:r>
       <w:r>
         <w:rPr>
           <w:rFonts w:ascii="Times New Roman" w:cs="Times New Roman" w:eastAsia="Times New Roman" w:hAnsi="Times New Roman"/>
-          <w:sz w:val="19"/>
-          <w:szCs w:val="19"/>
+          <w:sz w:val="20"/>
+          <w:szCs w:val="20"/>
         </w:rPr>
         <w:t xml:space="preserve">, 2023 – Present</w:t>
       </w:r>
@@ -676,8 +676,8 @@
       <w:r>
         <w:rPr>
           <w:rFonts w:ascii="Times New Roman" w:cs="Times New Roman" w:eastAsia="Times New Roman" w:hAnsi="Times New Roman"/>
-          <w:sz w:val="19"/>
-          <w:szCs w:val="19"/>
+          <w:sz w:val="20"/>
+          <w:szCs w:val="20"/>
         </w:rPr>
         <w:t xml:space="preserve">Created, as a parent, a book-shaped product that keeps a mobile phone out of sight; manage production, promotion, online sales (Naver Smart Store, Coupang), and delivery coordination; sold 2,000+ units (~$25K revenue)</w:t>
       </w:r>
@@ -693,8 +693,8 @@
           <w:rFonts w:ascii="Times New Roman" w:cs="Times New Roman" w:eastAsia="Times New Roman" w:hAnsi="Times New Roman"/>
           <w:b/>
           <w:bCs/>
-          <w:sz w:val="19"/>
-          <w:szCs w:val="19"/>
+          <w:sz w:val="20"/>
+          <w:szCs w:val="20"/>
         </w:rPr>
         <w:t xml:space="preserve">CPIM Study Web App</w:t>
       </w:r>
@@ -710,16 +710,16 @@
           <w:rFonts w:ascii="Times New Roman" w:cs="Times New Roman" w:eastAsia="Times New Roman" w:hAnsi="Times New Roman"/>
           <w:i/>
           <w:iCs/>
-          <w:sz w:val="19"/>
-          <w:szCs w:val="19"/>
+          <w:sz w:val="20"/>
+          <w:szCs w:val="20"/>
         </w:rPr>
         <w:t xml:space="preserve">Developer &amp; Content Creator</w:t>
       </w:r>
       <w:r>
         <w:rPr>
           <w:rFonts w:ascii="Times New Roman" w:cs="Times New Roman" w:eastAsia="Times New Roman" w:hAnsi="Times New Roman"/>
-          <w:sz w:val="19"/>
-          <w:szCs w:val="19"/>
+          <w:sz w:val="20"/>
+          <w:szCs w:val="20"/>
         </w:rPr>
         <w:t xml:space="preserve">, 2026 – Present</w:t>
       </w:r>
@@ -742,8 +742,8 @@
       <w:r>
         <w:rPr>
           <w:rFonts w:ascii="Times New Roman" w:cs="Times New Roman" w:eastAsia="Times New Roman" w:hAnsi="Times New Roman"/>
-          <w:sz w:val="19"/>
-          <w:szCs w:val="19"/>
+          <w:sz w:val="20"/>
+          <w:szCs w:val="20"/>
         </w:rPr>
         <w:t xml:space="preserve">Build a study web app with 1,500 practice questions and study notes, designing the UI in Figma and developing with Claude Code while inspecting and testing generated code</w:t>
       </w:r>
@@ -758,8 +758,8 @@
           <w:rFonts w:ascii="Times New Roman" w:cs="Times New Roman" w:eastAsia="Times New Roman" w:hAnsi="Times New Roman"/>
           <w:b/>
           <w:bCs/>
-          <w:sz w:val="19"/>
-          <w:szCs w:val="19"/>
+          <w:sz w:val="20"/>
+          <w:szCs w:val="20"/>
         </w:rPr>
         <w:t xml:space="preserve">SKILLS</w:t>
       </w:r>
@@ -774,16 +774,16 @@
           <w:rFonts w:ascii="Times New Roman" w:cs="Times New Roman" w:eastAsia="Times New Roman" w:hAnsi="Times New Roman"/>
           <w:b/>
           <w:bCs/>
-          <w:sz w:val="19"/>
-          <w:szCs w:val="19"/>
+          <w:sz w:val="20"/>
+          <w:szCs w:val="20"/>
         </w:rPr>
         <w:t xml:space="preserve">Technical: </w:t>
       </w:r>
       <w:r>
         <w:rPr>
           <w:rFonts w:ascii="Times New Roman" w:cs="Times New Roman" w:eastAsia="Times New Roman" w:hAnsi="Times New Roman"/>
-          <w:sz w:val="19"/>
-          <w:szCs w:val="19"/>
+          <w:sz w:val="20"/>
+          <w:szCs w:val="20"/>
         </w:rPr>
         <w:t xml:space="preserve">SQL, Python, Power BI, Tableau, Oracle BI, Google Analytics 4, Google Tag Manager, Figma, PROS O&amp;D RMS/RTDP, Amadeus RMS, DDS, MIDT, CIRIUM, Claude Code</w:t>
       </w:r>
@@ -798,16 +798,16 @@
           <w:rFonts w:ascii="Times New Roman" w:cs="Times New Roman" w:eastAsia="Times New Roman" w:hAnsi="Times New Roman"/>
           <w:b/>
           <w:bCs/>
-          <w:sz w:val="19"/>
-          <w:szCs w:val="19"/>
+          <w:sz w:val="20"/>
+          <w:szCs w:val="20"/>
         </w:rPr>
         <w:t xml:space="preserve">Certifications: </w:t>
       </w:r>
       <w:r>
         <w:rPr>
           <w:rFonts w:ascii="Times New Roman" w:cs="Times New Roman" w:eastAsia="Times New Roman" w:hAnsi="Times New Roman"/>
-          <w:sz w:val="19"/>
-          <w:szCs w:val="19"/>
+          <w:sz w:val="20"/>
+          <w:szCs w:val="20"/>
         </w:rPr>
         <w:t xml:space="preserve">PMP (PMI, 2026); CPIM (ASCM, 2025)</w:t>
       </w:r>
@@ -822,16 +822,16 @@
           <w:rFonts w:ascii="Times New Roman" w:cs="Times New Roman" w:eastAsia="Times New Roman" w:hAnsi="Times New Roman"/>
           <w:b/>
           <w:bCs/>
-          <w:sz w:val="19"/>
-          <w:szCs w:val="19"/>
+          <w:sz w:val="20"/>
+          <w:szCs w:val="20"/>
         </w:rPr>
         <w:t xml:space="preserve">Languages: </w:t>
       </w:r>
       <w:r>
         <w:rPr>
           <w:rFonts w:ascii="Times New Roman" w:cs="Times New Roman" w:eastAsia="Times New Roman" w:hAnsi="Times New Roman"/>
-          <w:sz w:val="19"/>
-          <w:szCs w:val="19"/>
+          <w:sz w:val="20"/>
+          <w:szCs w:val="20"/>
         </w:rPr>
         <w:t xml:space="preserve">Korean (Native), English (Proficient), Japanese (Fluent), Chinese (Basic)</w:t>
       </w:r>

</xml_diff>